<commit_message>
Remove T-shirt sizes from team details
</commit_message>
<xml_diff>
--- a/submission-template/DTM_Drainage_AI_Report.docx
+++ b/submission-template/DTM_Drainage_AI_Report.docx
@@ -40,17 +40,16 @@
         <w:tblLook w:firstColumn="1" w:firstRow="1" w:lastColumn="0" w:lastRow="0" w:noHBand="0" w:noVBand="1" w:val="04A0"/>
       </w:tblPr>
       <w:tblGrid>
-        <w:gridCol w:w="1440"/>
-        <w:gridCol w:w="1440"/>
-        <w:gridCol w:w="1440"/>
-        <w:gridCol w:w="1440"/>
-        <w:gridCol w:w="1440"/>
-        <w:gridCol w:w="1440"/>
+        <w:gridCol w:w="1728"/>
+        <w:gridCol w:w="1728"/>
+        <w:gridCol w:w="1728"/>
+        <w:gridCol w:w="1728"/>
+        <w:gridCol w:w="1728"/>
       </w:tblGrid>
       <w:tr>
         <w:tc>
           <w:tcPr>
-            <w:tcW w:type="dxa" w:w="1440"/>
+            <w:tcW w:type="dxa" w:w="1728"/>
           </w:tcPr>
           <w:p>
             <w:r>
@@ -60,7 +59,7 @@
         </w:tc>
         <w:tc>
           <w:tcPr>
-            <w:tcW w:type="dxa" w:w="1440"/>
+            <w:tcW w:type="dxa" w:w="1728"/>
           </w:tcPr>
           <w:p>
             <w:r>
@@ -70,7 +69,7 @@
         </w:tc>
         <w:tc>
           <w:tcPr>
-            <w:tcW w:type="dxa" w:w="1440"/>
+            <w:tcW w:type="dxa" w:w="1728"/>
           </w:tcPr>
           <w:p>
             <w:r>
@@ -80,7 +79,7 @@
         </w:tc>
         <w:tc>
           <w:tcPr>
-            <w:tcW w:type="dxa" w:w="1440"/>
+            <w:tcW w:type="dxa" w:w="1728"/>
           </w:tcPr>
           <w:p>
             <w:r>
@@ -90,7 +89,7 @@
         </w:tc>
         <w:tc>
           <w:tcPr>
-            <w:tcW w:type="dxa" w:w="1440"/>
+            <w:tcW w:type="dxa" w:w="1728"/>
           </w:tcPr>
           <w:p>
             <w:r>
@@ -98,21 +97,11 @@
             </w:r>
           </w:p>
         </w:tc>
-        <w:tc>
-          <w:tcPr>
-            <w:tcW w:type="dxa" w:w="1440"/>
-          </w:tcPr>
-          <w:p>
-            <w:r>
-              <w:t>T-shirt</w:t>
-            </w:r>
-          </w:p>
-        </w:tc>
       </w:tr>
       <w:tr>
         <w:tc>
           <w:tcPr>
-            <w:tcW w:type="dxa" w:w="1440"/>
+            <w:tcW w:type="dxa" w:w="1728"/>
           </w:tcPr>
           <w:p>
             <w:r>
@@ -122,7 +111,7 @@
         </w:tc>
         <w:tc>
           <w:tcPr>
-            <w:tcW w:type="dxa" w:w="1440"/>
+            <w:tcW w:type="dxa" w:w="1728"/>
           </w:tcPr>
           <w:p>
             <w:r>
@@ -132,7 +121,7 @@
         </w:tc>
         <w:tc>
           <w:tcPr>
-            <w:tcW w:type="dxa" w:w="1440"/>
+            <w:tcW w:type="dxa" w:w="1728"/>
           </w:tcPr>
           <w:p>
             <w:r>
@@ -142,7 +131,7 @@
         </w:tc>
         <w:tc>
           <w:tcPr>
-            <w:tcW w:type="dxa" w:w="1440"/>
+            <w:tcW w:type="dxa" w:w="1728"/>
           </w:tcPr>
           <w:p>
             <w:r>
@@ -152,7 +141,7 @@
         </w:tc>
         <w:tc>
           <w:tcPr>
-            <w:tcW w:type="dxa" w:w="1440"/>
+            <w:tcW w:type="dxa" w:w="1728"/>
           </w:tcPr>
           <w:p>
             <w:r>
@@ -160,21 +149,11 @@
             </w:r>
           </w:p>
         </w:tc>
-        <w:tc>
-          <w:tcPr>
-            <w:tcW w:type="dxa" w:w="1440"/>
-          </w:tcPr>
-          <w:p>
-            <w:r>
-              <w:t>XL</w:t>
-            </w:r>
-          </w:p>
-        </w:tc>
       </w:tr>
       <w:tr>
         <w:tc>
           <w:tcPr>
-            <w:tcW w:type="dxa" w:w="1440"/>
+            <w:tcW w:type="dxa" w:w="1728"/>
           </w:tcPr>
           <w:p>
             <w:r>
@@ -184,7 +163,7 @@
         </w:tc>
         <w:tc>
           <w:tcPr>
-            <w:tcW w:type="dxa" w:w="1440"/>
+            <w:tcW w:type="dxa" w:w="1728"/>
           </w:tcPr>
           <w:p>
             <w:r>
@@ -194,7 +173,7 @@
         </w:tc>
         <w:tc>
           <w:tcPr>
-            <w:tcW w:type="dxa" w:w="1440"/>
+            <w:tcW w:type="dxa" w:w="1728"/>
           </w:tcPr>
           <w:p>
             <w:r>
@@ -204,7 +183,7 @@
         </w:tc>
         <w:tc>
           <w:tcPr>
-            <w:tcW w:type="dxa" w:w="1440"/>
+            <w:tcW w:type="dxa" w:w="1728"/>
           </w:tcPr>
           <w:p>
             <w:r>
@@ -214,7 +193,7 @@
         </w:tc>
         <w:tc>
           <w:tcPr>
-            <w:tcW w:type="dxa" w:w="1440"/>
+            <w:tcW w:type="dxa" w:w="1728"/>
           </w:tcPr>
           <w:p>
             <w:r>
@@ -222,21 +201,11 @@
             </w:r>
           </w:p>
         </w:tc>
-        <w:tc>
-          <w:tcPr>
-            <w:tcW w:type="dxa" w:w="1440"/>
-          </w:tcPr>
-          <w:p>
-            <w:r>
-              <w:t>XL</w:t>
-            </w:r>
-          </w:p>
-        </w:tc>
       </w:tr>
       <w:tr>
         <w:tc>
           <w:tcPr>
-            <w:tcW w:type="dxa" w:w="1440"/>
+            <w:tcW w:type="dxa" w:w="1728"/>
           </w:tcPr>
           <w:p>
             <w:r>
@@ -246,7 +215,7 @@
         </w:tc>
         <w:tc>
           <w:tcPr>
-            <w:tcW w:type="dxa" w:w="1440"/>
+            <w:tcW w:type="dxa" w:w="1728"/>
           </w:tcPr>
           <w:p>
             <w:r>
@@ -256,7 +225,7 @@
         </w:tc>
         <w:tc>
           <w:tcPr>
-            <w:tcW w:type="dxa" w:w="1440"/>
+            <w:tcW w:type="dxa" w:w="1728"/>
           </w:tcPr>
           <w:p>
             <w:r>
@@ -266,7 +235,7 @@
         </w:tc>
         <w:tc>
           <w:tcPr>
-            <w:tcW w:type="dxa" w:w="1440"/>
+            <w:tcW w:type="dxa" w:w="1728"/>
           </w:tcPr>
           <w:p>
             <w:r>
@@ -276,7 +245,7 @@
         </w:tc>
         <w:tc>
           <w:tcPr>
-            <w:tcW w:type="dxa" w:w="1440"/>
+            <w:tcW w:type="dxa" w:w="1728"/>
           </w:tcPr>
           <w:p>
             <w:r>
@@ -284,21 +253,11 @@
             </w:r>
           </w:p>
         </w:tc>
-        <w:tc>
-          <w:tcPr>
-            <w:tcW w:type="dxa" w:w="1440"/>
-          </w:tcPr>
-          <w:p>
-            <w:r>
-              <w:t>S</w:t>
-            </w:r>
-          </w:p>
-        </w:tc>
       </w:tr>
       <w:tr>
         <w:tc>
           <w:tcPr>
-            <w:tcW w:type="dxa" w:w="1440"/>
+            <w:tcW w:type="dxa" w:w="1728"/>
           </w:tcPr>
           <w:p>
             <w:r>
@@ -308,7 +267,7 @@
         </w:tc>
         <w:tc>
           <w:tcPr>
-            <w:tcW w:type="dxa" w:w="1440"/>
+            <w:tcW w:type="dxa" w:w="1728"/>
           </w:tcPr>
           <w:p>
             <w:r>
@@ -318,7 +277,7 @@
         </w:tc>
         <w:tc>
           <w:tcPr>
-            <w:tcW w:type="dxa" w:w="1440"/>
+            <w:tcW w:type="dxa" w:w="1728"/>
           </w:tcPr>
           <w:p>
             <w:r>
@@ -328,7 +287,7 @@
         </w:tc>
         <w:tc>
           <w:tcPr>
-            <w:tcW w:type="dxa" w:w="1440"/>
+            <w:tcW w:type="dxa" w:w="1728"/>
           </w:tcPr>
           <w:p>
             <w:r>
@@ -338,7 +297,7 @@
         </w:tc>
         <w:tc>
           <w:tcPr>
-            <w:tcW w:type="dxa" w:w="1440"/>
+            <w:tcW w:type="dxa" w:w="1728"/>
           </w:tcPr>
           <w:p>
             <w:r>
@@ -346,21 +305,11 @@
             </w:r>
           </w:p>
         </w:tc>
-        <w:tc>
-          <w:tcPr>
-            <w:tcW w:type="dxa" w:w="1440"/>
-          </w:tcPr>
-          <w:p>
-            <w:r>
-              <w:t>M</w:t>
-            </w:r>
-          </w:p>
-        </w:tc>
       </w:tr>
       <w:tr>
         <w:tc>
           <w:tcPr>
-            <w:tcW w:type="dxa" w:w="1440"/>
+            <w:tcW w:type="dxa" w:w="1728"/>
           </w:tcPr>
           <w:p>
             <w:r>
@@ -370,7 +319,7 @@
         </w:tc>
         <w:tc>
           <w:tcPr>
-            <w:tcW w:type="dxa" w:w="1440"/>
+            <w:tcW w:type="dxa" w:w="1728"/>
           </w:tcPr>
           <w:p>
             <w:r>
@@ -380,7 +329,7 @@
         </w:tc>
         <w:tc>
           <w:tcPr>
-            <w:tcW w:type="dxa" w:w="1440"/>
+            <w:tcW w:type="dxa" w:w="1728"/>
           </w:tcPr>
           <w:p>
             <w:r>
@@ -390,7 +339,7 @@
         </w:tc>
         <w:tc>
           <w:tcPr>
-            <w:tcW w:type="dxa" w:w="1440"/>
+            <w:tcW w:type="dxa" w:w="1728"/>
           </w:tcPr>
           <w:p>
             <w:r>
@@ -400,21 +349,11 @@
         </w:tc>
         <w:tc>
           <w:tcPr>
-            <w:tcW w:type="dxa" w:w="1440"/>
+            <w:tcW w:type="dxa" w:w="1728"/>
           </w:tcPr>
           <w:p>
             <w:r>
               <w:t>Siddhartha Academy of Higher Education</w:t>
-            </w:r>
-          </w:p>
-        </w:tc>
-        <w:tc>
-          <w:tcPr>
-            <w:tcW w:type="dxa" w:w="1440"/>
-          </w:tcPr>
-          <w:p>
-            <w:r>
-              <w:t>XXL</w:t>
             </w:r>
           </w:p>
         </w:tc>

</xml_diff>